<commit_message>
Day 11 Memory efficiency using generator:yield
</commit_message>
<xml_diff>
--- a/0.1 Companies/Skills.docx
+++ b/0.1 Companies/Skills.docx
@@ -11,21 +11,8 @@
         </w:numPr>
       </w:pPr>
       <w:r>
-        <w:t xml:space="preserve">I can test whole model using </w:t>
+        <w:t>I can test whole model using pytest which will ensure security and model preservance</w:t>
       </w:r>
-      <w:proofErr w:type="spellStart"/>
-      <w:r>
-        <w:t>pytest</w:t>
-      </w:r>
-      <w:proofErr w:type="spellEnd"/>
-      <w:r>
-        <w:t xml:space="preserve"> which will ensure security and model </w:t>
-      </w:r>
-      <w:proofErr w:type="spellStart"/>
-      <w:r>
-        <w:t>preservance</w:t>
-      </w:r>
-      <w:proofErr w:type="spellEnd"/>
     </w:p>
     <w:p>
       <w:pPr>
@@ -59,6 +46,39 @@
           <w:numId w:val="1"/>
         </w:numPr>
       </w:pPr>
+      <w:r>
+        <w:t>I can use configuration management for project</w:t>
+      </w:r>
+    </w:p>
+    <w:p>
+      <w:pPr>
+        <w:pStyle w:val="ListParagraph"/>
+        <w:numPr>
+          <w:ilvl w:val="0"/>
+          <w:numId w:val="1"/>
+        </w:numPr>
+      </w:pPr>
+      <w:r>
+        <w:t>I can data validation for system</w:t>
+      </w:r>
+    </w:p>
+    <w:p>
+      <w:pPr>
+        <w:pStyle w:val="ListParagraph"/>
+        <w:numPr>
+          <w:ilvl w:val="0"/>
+          <w:numId w:val="1"/>
+        </w:numPr>
+      </w:pPr>
+      <w:r>
+        <w:t>I can process streams using generator (</w:t>
+      </w:r>
+      <w:r>
+        <w:t>Process streams, not giant objects.</w:t>
+      </w:r>
+      <w:r>
+        <w:t>)</w:t>
+      </w:r>
     </w:p>
     <w:sectPr>
       <w:pgSz w:w="11906" w:h="16838"/>

</xml_diff>

<commit_message>
Day 19 asynccontext manager , life spane and app.state..
</commit_message>
<xml_diff>
--- a/0.1 Companies/Skills.docx
+++ b/0.1 Companies/Skills.docx
@@ -111,7 +111,25 @@
         <w:jc w:val="both"/>
       </w:pPr>
       <w:r>
-        <w:t>Type Safety &amp; Schema Validation via Pydantic</w:t>
+        <w:t xml:space="preserve">Type Safety &amp; Schema Validation via </w:t>
+      </w:r>
+      <w:proofErr w:type="spellStart"/>
+      <w:r>
+        <w:t>Pydantic</w:t>
+      </w:r>
+      <w:proofErr w:type="spellEnd"/>
+    </w:p>
+    <w:p>
+      <w:pPr>
+        <w:pStyle w:val="ListParagraph"/>
+        <w:numPr>
+          <w:ilvl w:val="0"/>
+          <w:numId w:val="2"/>
+        </w:numPr>
+        <w:jc w:val="both"/>
+      </w:pPr>
+      <w:r>
+        <w:t>API Lifespan State Management</w:t>
       </w:r>
     </w:p>
     <w:sectPr>

</xml_diff>

<commit_message>
DAY 20 fastapi Backgroundtasks, polling, webhook
</commit_message>
<xml_diff>
--- a/0.1 Companies/Skills.docx
+++ b/0.1 Companies/Skills.docx
@@ -130,6 +130,19 @@
       </w:pPr>
       <w:r>
         <w:t>API Lifespan State Management</w:t>
+      </w:r>
+    </w:p>
+    <w:p>
+      <w:pPr>
+        <w:pStyle w:val="ListParagraph"/>
+        <w:numPr>
+          <w:ilvl w:val="0"/>
+          <w:numId w:val="2"/>
+        </w:numPr>
+        <w:jc w:val="both"/>
+      </w:pPr>
+      <w:r>
+        <w:t>Asynchronous Background Processing</w:t>
       </w:r>
     </w:p>
     <w:sectPr>

</xml_diff>

<commit_message>
pydantic and sqlalchemy orm integration
</commit_message>
<xml_diff>
--- a/0.1 Companies/Skills.docx
+++ b/0.1 Companies/Skills.docx
@@ -143,6 +143,30 @@
       </w:pPr>
       <w:r>
         <w:t>Asynchronous Background Processing</w:t>
+      </w:r>
+    </w:p>
+    <w:p>
+      <w:pPr>
+        <w:pStyle w:val="ListParagraph"/>
+        <w:numPr>
+          <w:ilvl w:val="0"/>
+          <w:numId w:val="2"/>
+        </w:numPr>
+        <w:jc w:val="both"/>
+      </w:pPr>
+      <w:r>
+        <w:t xml:space="preserve">I can </w:t>
+      </w:r>
+      <w:r>
+        <w:t xml:space="preserve">pipe all incoming inference requests and output scores through an asynchronous </w:t>
+      </w:r>
+      <w:proofErr w:type="spellStart"/>
+      <w:r>
+        <w:t>SQLAlchemy</w:t>
+      </w:r>
+      <w:proofErr w:type="spellEnd"/>
+      <w:r>
+        <w:t xml:space="preserve"> ORM into a persistent database for downstream drift analysis</w:t>
       </w:r>
     </w:p>
     <w:sectPr>

</xml_diff>